<commit_message>
Update completed degree wording
</commit_message>
<xml_diff>
--- a/Ian_Alloway_Resume_CV.docx
+++ b/Ian_Alloway_Resume_CV.docx
@@ -9,7 +9,7 @@
       <w:r>
         <w:rPr>
           <w:b/>
-          <w:sz w:val="36"/>
+          <w:sz w:val="34"/>
         </w:rPr>
         <w:t>Ian Alloway</w:t>
       </w:r>
@@ -19,10 +19,47 @@
         <w:jc w:val="center"/>
       </w:pPr>
       <w:r>
-        <w:rPr>
-          <w:sz w:val="17"/>
-        </w:rPr>
-        <w:t>Fairmont, WV (Remote-Friendly) | 727-470-8666 | ian@allowayllc.com | linkedin.com/in/ianit | github.com/ianalloway | ianalloway.xyz | allowayai.substack.com</w:t>
+        <w:t>Fairmont, WV (Remote-Friendly)</w:t>
+      </w:r>
+    </w:p>
+    <w:p>
+      <w:pPr>
+        <w:jc w:val="center"/>
+      </w:pPr>
+      <w:r>
+        <w:t>727-470-8666 | ian@allowayllc.com</w:t>
+      </w:r>
+    </w:p>
+    <w:p>
+      <w:pPr>
+        <w:jc w:val="center"/>
+      </w:pPr>
+      <w:r>
+        <w:t>LinkedIn: https://linkedin.com/in/ianit</w:t>
+      </w:r>
+    </w:p>
+    <w:p>
+      <w:pPr>
+        <w:jc w:val="center"/>
+      </w:pPr>
+      <w:r>
+        <w:t>GitHub: https://github.com/ianalloway</w:t>
+      </w:r>
+    </w:p>
+    <w:p>
+      <w:pPr>
+        <w:jc w:val="center"/>
+      </w:pPr>
+      <w:r>
+        <w:t>Portfolio: https://ianalloway.xyz</w:t>
+      </w:r>
+    </w:p>
+    <w:p>
+      <w:pPr>
+        <w:jc w:val="center"/>
+      </w:pPr>
+      <w:r>
+        <w:t>Substack: https://allowayai.substack.com</w:t>
       </w:r>
     </w:p>
     <w:p>
@@ -36,10 +73,7 @@
     </w:p>
     <w:p>
       <w:r>
-        <w:rPr>
-          <w:sz w:val="18"/>
-        </w:rPr>
-        <w:t>ML Engineer and Data Scientist building production ML systems, evaluation tooling, and analytics products. Completed a B.S. in Information Science at the University of South Florida and currently pursuing an M.S. in Artificial Intelligence at USF. Founder of Alloway LLC, with experience shipping applied ML, dashboards, and decision-support software across sports analytics, fintech, and cybersecurity.</w:t>
+        <w:t>ML Engineer and Data Scientist building production ML systems, LLM evaluation tooling, and analytics products. Completed a B.S. in Information Science at the University of South Florida in May 2026 and currently pursuing an M.S. in Artificial Intelligence at USF. Founder of Alloway LLC, with experience shipping applied ML, dashboards, and decision-support software across sports analytics, fintech, cybersecurity, and AI evaluation workflows.</w:t>
       </w:r>
     </w:p>
     <w:p>
@@ -53,42 +87,27 @@
     </w:p>
     <w:p>
       <w:r>
-        <w:rPr>
-          <w:sz w:val="18"/>
-        </w:rPr>
         <w:t>Languages: Python, SQL, TypeScript, JavaScript, R, Bash</w:t>
       </w:r>
     </w:p>
     <w:p>
       <w:r>
-        <w:rPr>
-          <w:sz w:val="18"/>
-        </w:rPr>
-        <w:t>ML / AI: Scikit-learn, XGBoost, PyTorch, TensorFlow, NLP, model evaluation, calibration, forecasting, computer vision</w:t>
+        <w:t>ML / AI: Scikit-learn, XGBoost, PyTorch, TensorFlow, NLP, LLM-as-judge audits, prompt-injection evaluation, model evaluation, calibration, forecasting</w:t>
       </w:r>
     </w:p>
     <w:p>
       <w:r>
-        <w:rPr>
-          <w:sz w:val="18"/>
-        </w:rPr>
         <w:t>Data / Analytics: Pandas, NumPy, Tableau, Power BI, statistical analysis, experimentation, dashboarding</w:t>
       </w:r>
     </w:p>
     <w:p>
       <w:r>
-        <w:rPr>
-          <w:sz w:val="18"/>
-        </w:rPr>
         <w:t>Backend / Infra: FastAPI, React, Node.js, PostgreSQL, SQLite, Redis, Docker, Git, GitHub Actions, AWS</w:t>
       </w:r>
     </w:p>
     <w:p>
       <w:r>
-        <w:rPr>
-          <w:sz w:val="18"/>
-        </w:rPr>
-        <w:t>Domain Experience: Sports analytics, blockchain analytics, fraud detection, decision-support systems</w:t>
+        <w:t>Domain Experience: AI evaluation, sports analytics, blockchain analytics, fraud detection, decision-support systems</w:t>
       </w:r>
     </w:p>
     <w:p>
@@ -102,17 +121,11 @@
     </w:p>
     <w:p>
       <w:r>
-        <w:rPr>
-          <w:sz w:val="18"/>
-        </w:rPr>
         <w:t>Founder &amp; Data Consultant, Alloway LLC</w:t>
       </w:r>
     </w:p>
     <w:p>
       <w:r>
-        <w:rPr>
-          <w:sz w:val="18"/>
-        </w:rPr>
         <w:t>July 2023 - Present | Morgantown, WV</w:t>
       </w:r>
     </w:p>
@@ -121,9 +134,6 @@
         <w:pStyle w:val="ListBullet"/>
       </w:pPr>
       <w:r>
-        <w:rPr>
-          <w:sz w:val="18"/>
-        </w:rPr>
         <w:t>Founded a consultancy delivering applied ML, analytics, and automation solutions for sports, fintech, and business operations use cases.</w:t>
       </w:r>
     </w:p>
@@ -132,9 +142,6 @@
         <w:pStyle w:val="ListBullet"/>
       </w:pPr>
       <w:r>
-        <w:rPr>
-          <w:sz w:val="18"/>
-        </w:rPr>
         <w:t>Developed and deployed ML-driven decision tools that improved client operational efficiency by 40%.</w:t>
       </w:r>
     </w:p>
@@ -143,9 +150,6 @@
         <w:pStyle w:val="ListBullet"/>
       </w:pPr>
       <w:r>
-        <w:rPr>
-          <w:sz w:val="18"/>
-        </w:rPr>
         <w:t>Built production dashboards and reporting workflows in Tableau and Power BI across marketing, logistics, and customer-service data.</w:t>
       </w:r>
     </w:p>
@@ -154,25 +158,16 @@
         <w:pStyle w:val="ListBullet"/>
       </w:pPr>
       <w:r>
-        <w:rPr>
-          <w:sz w:val="18"/>
-        </w:rPr>
         <w:t>Led engagements end to end: requirements gathering, implementation, deployment, documentation, and client handoff.</w:t>
       </w:r>
     </w:p>
     <w:p>
       <w:r>
-        <w:rPr>
-          <w:sz w:val="18"/>
-        </w:rPr>
         <w:t>Data Auditor / AI Engineer, Omniichain</w:t>
       </w:r>
     </w:p>
     <w:p>
       <w:r>
-        <w:rPr>
-          <w:sz w:val="18"/>
-        </w:rPr>
         <w:t>Jan 2020 - Dec 2024 | Remote</w:t>
       </w:r>
     </w:p>
@@ -181,9 +176,6 @@
         <w:pStyle w:val="ListBullet"/>
       </w:pPr>
       <w:r>
-        <w:rPr>
-          <w:sz w:val="18"/>
-        </w:rPr>
         <w:t>Extracted, normalized, and analyzed multi-chain blockchain data from Ethereum, Solana, and Polkadot networks.</w:t>
       </w:r>
     </w:p>
@@ -192,9 +184,6 @@
         <w:pStyle w:val="ListBullet"/>
       </w:pPr>
       <w:r>
-        <w:rPr>
-          <w:sz w:val="18"/>
-        </w:rPr>
         <w:t>Built anomaly-detection tooling that reduced fraud incidents by 30%.</w:t>
       </w:r>
     </w:p>
@@ -203,9 +192,6 @@
         <w:pStyle w:val="ListBullet"/>
       </w:pPr>
       <w:r>
-        <w:rPr>
-          <w:sz w:val="18"/>
-        </w:rPr>
         <w:t>Created dashboards for token flow, market movement, and transactional risk monitoring.</w:t>
       </w:r>
     </w:p>
@@ -214,25 +200,16 @@
         <w:pStyle w:val="ListBullet"/>
       </w:pPr>
       <w:r>
-        <w:rPr>
-          <w:sz w:val="18"/>
-        </w:rPr>
         <w:t>Benchmarked smart-contract performance and data quality workflows using Python and SQL.</w:t>
       </w:r>
     </w:p>
     <w:p>
       <w:r>
-        <w:rPr>
-          <w:sz w:val="18"/>
-        </w:rPr>
         <w:t>Sales &amp; Purchasing Manager, IT Parts and Spares Ltd.</w:t>
       </w:r>
     </w:p>
     <w:p>
       <w:r>
-        <w:rPr>
-          <w:sz w:val="18"/>
-        </w:rPr>
         <w:t>Sept 2018 - Aug 2020 | Miami/Fort Lauderdale, FL</w:t>
       </w:r>
     </w:p>
@@ -241,9 +218,6 @@
         <w:pStyle w:val="ListBullet"/>
       </w:pPr>
       <w:r>
-        <w:rPr>
-          <w:sz w:val="18"/>
-        </w:rPr>
         <w:t>Led procurement operations with international vendors, optimizing logistics and reducing costs by 15%.</w:t>
       </w:r>
     </w:p>
@@ -252,9 +226,6 @@
         <w:pStyle w:val="ListBullet"/>
       </w:pPr>
       <w:r>
-        <w:rPr>
-          <w:sz w:val="18"/>
-        </w:rPr>
         <w:t>Maintained inventory and purchasing systems with a strong focus on data accuracy and operational visibility.</w:t>
       </w:r>
     </w:p>
@@ -263,25 +234,16 @@
         <w:pStyle w:val="ListBullet"/>
       </w:pPr>
       <w:r>
-        <w:rPr>
-          <w:sz w:val="18"/>
-        </w:rPr>
         <w:t>Forecasted demand and negotiated pricing across major OEM contracts including HP, IBM, Lenovo, and Dell.</w:t>
       </w:r>
     </w:p>
     <w:p>
       <w:r>
-        <w:rPr>
-          <w:sz w:val="18"/>
-        </w:rPr>
         <w:t>Task Force Manager, Hilton Hotels</w:t>
       </w:r>
     </w:p>
     <w:p>
       <w:r>
-        <w:rPr>
-          <w:sz w:val="18"/>
-        </w:rPr>
         <w:t>Aug 2020 - Sept 2023 | Tampa, FL</w:t>
       </w:r>
     </w:p>
@@ -290,9 +252,6 @@
         <w:pStyle w:val="ListBullet"/>
       </w:pPr>
       <w:r>
-        <w:rPr>
-          <w:sz w:val="18"/>
-        </w:rPr>
         <w:t>Directed operational improvements across multiple properties, achieving measurable guest satisfaction increases up to 20%.</w:t>
       </w:r>
     </w:p>
@@ -301,9 +260,6 @@
         <w:pStyle w:val="ListBullet"/>
       </w:pPr>
       <w:r>
-        <w:rPr>
-          <w:sz w:val="18"/>
-        </w:rPr>
         <w:t>Managed property P&amp;L, budgets, vendor relationships, and GM-level operational coverage during transitions.</w:t>
       </w:r>
     </w:p>
@@ -318,58 +274,37 @@
     </w:p>
     <w:p>
       <w:r>
-        <w:rPr>
-          <w:sz w:val="18"/>
-        </w:rPr>
+        <w:t>juryrig: Zero-dependency Python toolkit for auditing LLM-as-judge pipelines across position bias, verbosity bias, prompt-injection susceptibility, self-consistency, judge panels, and calibration scoring. Python. https://github.com/ianalloway/juryrig</w:t>
+      </w:r>
+    </w:p>
+    <w:p>
+      <w:r>
         <w:t>AI Advantage Sports: Sports analytics platform with ML predictions, Kelly-based bet sizing, and live product workflows for NBA use cases. React, Python, XGBoost. https://aiadvantagesports.com</w:t>
       </w:r>
     </w:p>
     <w:p>
       <w:r>
-        <w:rPr>
-          <w:sz w:val="18"/>
-        </w:rPr>
         <w:t>nba-ratings: Reusable Elo, win-probability, and Kelly-sizing library for NBA-style models; designed as installable evaluation primitives. Python. https://github.com/ianalloway/nba-ratings</w:t>
       </w:r>
     </w:p>
     <w:p>
       <w:r>
-        <w:rPr>
-          <w:sz w:val="18"/>
-        </w:rPr>
         <w:t>NBA CLV Dashboard: FastAPI and Chart.js dashboard for calibration, rolling accuracy, and CLV-style evaluation reporting. Python, FastAPI, Chart.js. https://github.com/ianalloway/nba-clv-dashboard</w:t>
       </w:r>
     </w:p>
     <w:p>
       <w:r>
-        <w:rPr>
-          <w:sz w:val="18"/>
-        </w:rPr>
         <w:t>Sports Betting ML: Applied NBA/NFL modeling project using logistic regression, XGBoost, and ensemble methods for edge detection. Python, XGBoost. https://huggingface.co/spaces/ianalloway/sports-betting-ml</w:t>
       </w:r>
     </w:p>
     <w:p>
       <w:r>
-        <w:rPr>
-          <w:sz w:val="18"/>
-        </w:rPr>
         <w:t>kelly-js: TypeScript package for Kelly sizing, odds conversion, and bankroll math in lightweight decision-support workflows. TypeScript, npm. https://github.com/ianalloway/kelly-js</w:t>
       </w:r>
     </w:p>
     <w:p>
       <w:r>
-        <w:rPr>
-          <w:sz w:val="18"/>
-        </w:rPr>
         <w:t>Repo Health: CLI that scores repository quality across README quality, CI, licensing, staleness, and maintenance indicators. Python CLI. https://github.com/ianalloway/repo-health</w:t>
-      </w:r>
-    </w:p>
-    <w:p>
-      <w:r>
-        <w:rPr>
-          <w:sz w:val="18"/>
-        </w:rPr>
-        <w:t>macOS Disk Cleanup: Open-source Bash CLI that safely reclaims macOS disk space by removing regenerable caches only, with dry-run support and ShellCheck CI. Bash, GitHub Actions. https://github.com/ianalloway/macos-disk-cleanup</w:t>
       </w:r>
     </w:p>
     <w:p>
@@ -383,9 +318,6 @@
     </w:p>
     <w:p>
       <w:r>
-        <w:rPr>
-          <w:sz w:val="18"/>
-        </w:rPr>
         <w:t>OpenClaw: Contributor to the OpenClaw AI agent framework, including bug fixes, skill-system improvements, and published agent skills on ClawHub. https://github.com/openclaw/openclaw</w:t>
       </w:r>
     </w:p>
@@ -400,34 +332,22 @@
     </w:p>
     <w:p>
       <w:r>
-        <w:rPr>
-          <w:sz w:val="18"/>
-        </w:rPr>
         <w:t>M.S. Artificial Intelligence, University of South Florida</w:t>
       </w:r>
     </w:p>
     <w:p>
       <w:r>
-        <w:rPr>
-          <w:sz w:val="18"/>
-        </w:rPr>
         <w:t>In Progress</w:t>
       </w:r>
     </w:p>
     <w:p>
       <w:r>
-        <w:rPr>
-          <w:sz w:val="18"/>
-        </w:rPr>
         <w:t>B.S. Information Science, University of South Florida</w:t>
       </w:r>
     </w:p>
     <w:p>
       <w:r>
-        <w:rPr>
-          <w:sz w:val="18"/>
-        </w:rPr>
-        <w:t>Completed</w:t>
+        <w:t>Completed May 2026</w:t>
       </w:r>
     </w:p>
     <w:p>
@@ -441,55 +361,37 @@
     </w:p>
     <w:p>
       <w:r>
-        <w:rPr>
-          <w:sz w:val="18"/>
-        </w:rPr>
         <w:t>Deep Learning Specialization (Andrew Ng, Coursera)</w:t>
       </w:r>
     </w:p>
     <w:p>
       <w:r>
-        <w:rPr>
-          <w:sz w:val="18"/>
-        </w:rPr>
         <w:t>Machine Learning Engineering (Google Cloud)</w:t>
       </w:r>
     </w:p>
     <w:p>
       <w:r>
-        <w:rPr>
-          <w:sz w:val="18"/>
-        </w:rPr>
         <w:t>AWS Certified Cloud Practitioner</w:t>
       </w:r>
     </w:p>
     <w:p>
       <w:r>
-        <w:rPr>
-          <w:sz w:val="18"/>
-        </w:rPr>
         <w:t>Blockchain Fundamentals (UC Berkeley)</w:t>
       </w:r>
     </w:p>
     <w:p>
       <w:r>
-        <w:rPr>
-          <w:sz w:val="18"/>
-        </w:rPr>
         <w:t>Oracle Database SQL Certified Associate</w:t>
       </w:r>
     </w:p>
     <w:p>
       <w:r>
-        <w:rPr>
-          <w:sz w:val="18"/>
-        </w:rPr>
         <w:t>Tableau Desktop Certified Professional</w:t>
       </w:r>
     </w:p>
     <w:sectPr>
       <w:pgSz w:w="12240" w:h="15840"/>
-      <w:pgMar w:top="720" w:right="792" w:bottom="720" w:left="792" w:header="720" w:footer="720" w:gutter="0"/>
+      <w:pgMar w:top="648" w:right="792" w:bottom="648" w:left="792" w:header="720" w:footer="720" w:gutter="0"/>
       <w:cols w:space="720"/>
       <w:docGrid w:linePitch="360"/>
     </w:sectPr>
@@ -860,6 +762,10 @@
     <w:name w:val="Normal"/>
     <w:qFormat/>
     <w:rsid w:val="00FC693F"/>
+    <w:rPr>
+      <w:rFonts w:ascii="Arial" w:hAnsi="Arial"/>
+      <w:sz w:val="19"/>
+    </w:rPr>
   </w:style>
   <w:style w:type="paragraph" w:styleId="Header">
     <w:name w:val="header"/>
@@ -920,7 +826,7 @@
       <w:outlineLvl w:val="0"/>
     </w:pPr>
     <w:rPr>
-      <w:rFonts w:asciiTheme="majorHAnsi" w:eastAsiaTheme="majorEastAsia" w:hAnsiTheme="majorHAnsi" w:cstheme="majorBidi"/>
+      <w:rFonts w:asciiTheme="majorHAnsi" w:eastAsiaTheme="majorEastAsia" w:hAnsiTheme="majorHAnsi" w:cstheme="majorBidi" w:ascii="Arial" w:hAnsi="Arial"/>
       <w:b/>
       <w:bCs/>
       <w:color w:val="365F91" w:themeColor="accent1" w:themeShade="BF"/>
@@ -944,7 +850,7 @@
       <w:outlineLvl w:val="1"/>
     </w:pPr>
     <w:rPr>
-      <w:rFonts w:asciiTheme="majorHAnsi" w:eastAsiaTheme="majorEastAsia" w:hAnsiTheme="majorHAnsi" w:cstheme="majorBidi"/>
+      <w:rFonts w:asciiTheme="majorHAnsi" w:eastAsiaTheme="majorEastAsia" w:hAnsiTheme="majorHAnsi" w:cstheme="majorBidi" w:ascii="Arial" w:hAnsi="Arial"/>
       <w:b/>
       <w:bCs/>
       <w:color w:val="4F81BD" w:themeColor="accent1"/>
@@ -1209,7 +1115,7 @@
       <w:contextualSpacing/>
     </w:pPr>
     <w:rPr>
-      <w:rFonts w:asciiTheme="majorHAnsi" w:eastAsiaTheme="majorEastAsia" w:hAnsiTheme="majorHAnsi" w:cstheme="majorBidi"/>
+      <w:rFonts w:asciiTheme="majorHAnsi" w:eastAsiaTheme="majorEastAsia" w:hAnsiTheme="majorHAnsi" w:cstheme="majorBidi" w:ascii="Arial" w:hAnsi="Arial"/>
       <w:color w:val="17365D" w:themeColor="text2" w:themeShade="BF"/>
       <w:spacing w:val="5"/>
       <w:kern w:val="28"/>

</xml_diff>

<commit_message>
add project sunflower to resume
</commit_message>
<xml_diff>
--- a/Ian_Alloway_Resume_CV.docx
+++ b/Ian_Alloway_Resume_CV.docx
@@ -716,6 +716,43 @@
           <w:color w:val="114C72"/>
         </w:rPr>
         <w:t xml:space="preserve">SELECTED PROJECTS</w:t>
+      </w:r>
+    </w:p>
+    <w:p>
+      <w:pPr/>
+      <w:r>
+        <w:rPr>
+          <w:rFonts w:ascii="Helvetica Neue" w:hAnsi="Helvetica Neue" w:cs="Helvetica Neue"/>
+          <w:sz w:val="27"/>
+          <w:sz-cs w:val="27"/>
+          <w:b/>
+          <w:spacing w:val="0"/>
+          <w:color w:val="121826"/>
+        </w:rPr>
+        <w:t xml:space="preserve">Project Sunflower</w:t>
+      </w:r>
+      <w:r>
+        <w:rPr>
+          <w:rFonts w:ascii="Helvetica Neue" w:hAnsi="Helvetica Neue" w:cs="Helvetica Neue"/>
+          <w:sz w:val="27"/>
+          <w:sz-cs w:val="27"/>
+          <w:spacing w:val="0"/>
+          <w:color w:val="121826"/>
+        </w:rPr>
+        <w:t xml:space="preserve"> | ChatGPT app evaluation</w:t>
+      </w:r>
+    </w:p>
+    <w:p>
+      <w:pPr/>
+      <w:r>
+        <w:rPr>
+          <w:rFonts w:ascii="Helvetica Neue" w:hAnsi="Helvetica Neue" w:cs="Helvetica Neue"/>
+          <w:sz w:val="27"/>
+          <w:sz-cs w:val="27"/>
+          <w:spacing w:val="0"/>
+          <w:color w:val="121826"/>
+        </w:rPr>
+        <w:t xml:space="preserve">ChatGPT app-development and software-practices evaluation project focused on aesthetics, logic, taste, and overall product quality in agent-built applications.</w:t>
       </w:r>
     </w:p>
     <w:p>

</xml_diff>